<commit_message>
Second commit with updated screenshots
</commit_message>
<xml_diff>
--- a/module-1/luttrell_module1_2.docx
+++ b/module-1/luttrell_module1_2.docx
@@ -14,16 +14,8 @@
       </w:r>
       <w:r>
         <w:br/>
-        <w:t>Module 1.</w:t>
+        <w:t>Module 1.2 GIt</w:t>
       </w:r>
-      <w:r>
-        <w:t xml:space="preserve">2 </w:t>
-      </w:r>
-      <w:proofErr w:type="spellStart"/>
-      <w:r>
-        <w:t>GIt</w:t>
-      </w:r>
-      <w:proofErr w:type="spellEnd"/>
       <w:r>
         <w:br/>
         <w:t>3/22/26</w:t>
@@ -38,6 +30,9 @@
         <w:br/>
       </w:r>
       <w:r>
+        <w:rPr>
+          <w:noProof/>
+        </w:rPr>
         <w:drawing>
           <wp:inline distT="0" distB="0" distL="0" distR="0" wp14:anchorId="6D8ED04C" wp14:editId="3BC440FE">
             <wp:extent cx="5943600" cy="2408555"/>
@@ -77,7 +72,47 @@
     </w:p>
     <w:p/>
     <w:p>
-      <w:hyperlink r:id="rId5" w:history="1">
+      <w:r>
+        <w:lastRenderedPageBreak/>
+        <w:drawing>
+          <wp:inline distT="0" distB="0" distL="0" distR="0" wp14:anchorId="6F52FB0F" wp14:editId="623CDAA9">
+            <wp:extent cx="5943600" cy="7247890"/>
+            <wp:effectExtent l="0" t="0" r="0" b="0"/>
+            <wp:docPr id="904194929" name="Picture 1"/>
+            <wp:cNvGraphicFramePr>
+              <a:graphicFrameLocks xmlns:a="http://schemas.openxmlformats.org/drawingml/2006/main" noChangeAspect="1"/>
+            </wp:cNvGraphicFramePr>
+            <a:graphic xmlns:a="http://schemas.openxmlformats.org/drawingml/2006/main">
+              <a:graphicData uri="http://schemas.openxmlformats.org/drawingml/2006/picture">
+                <pic:pic xmlns:pic="http://schemas.openxmlformats.org/drawingml/2006/picture">
+                  <pic:nvPicPr>
+                    <pic:cNvPr id="904194929" name=""/>
+                    <pic:cNvPicPr/>
+                  </pic:nvPicPr>
+                  <pic:blipFill>
+                    <a:blip r:embed="rId5"/>
+                    <a:stretch>
+                      <a:fillRect/>
+                    </a:stretch>
+                  </pic:blipFill>
+                  <pic:spPr>
+                    <a:xfrm>
+                      <a:off x="0" y="0"/>
+                      <a:ext cx="5943600" cy="7247890"/>
+                    </a:xfrm>
+                    <a:prstGeom prst="rect">
+                      <a:avLst/>
+                    </a:prstGeom>
+                  </pic:spPr>
+                </pic:pic>
+              </a:graphicData>
+            </a:graphic>
+          </wp:inline>
+        </w:drawing>
+      </w:r>
+    </w:p>
+    <w:p>
+      <w:hyperlink r:id="rId6" w:history="1">
         <w:r>
           <w:rPr>
             <w:rStyle w:val="Hyperlink"/>

</xml_diff>

<commit_message>
Comitting Module 2 Assignment
</commit_message>
<xml_diff>
--- a/module-1/luttrell_module1_2.docx
+++ b/module-1/luttrell_module1_2.docx
@@ -73,6 +73,9 @@
     <w:p/>
     <w:p>
       <w:r>
+        <w:rPr>
+          <w:noProof/>
+        </w:rPr>
         <w:lastRenderedPageBreak/>
         <w:drawing>
           <wp:inline distT="0" distB="0" distL="0" distR="0" wp14:anchorId="6F52FB0F" wp14:editId="623CDAA9">
@@ -120,6 +123,49 @@
           <w:t>https://github.com/Aquinastine/csd-430</w:t>
         </w:r>
       </w:hyperlink>
+      <w:r>
+        <w:br/>
+      </w:r>
+      <w:r>
+        <w:br/>
+      </w:r>
+      <w:r>
+        <w:drawing>
+          <wp:inline distT="0" distB="0" distL="0" distR="0" wp14:anchorId="2FC0EB1A" wp14:editId="1305668F">
+            <wp:extent cx="5943600" cy="3449955"/>
+            <wp:effectExtent l="0" t="0" r="0" b="0"/>
+            <wp:docPr id="815613917" name="Picture 1"/>
+            <wp:cNvGraphicFramePr>
+              <a:graphicFrameLocks xmlns:a="http://schemas.openxmlformats.org/drawingml/2006/main" noChangeAspect="1"/>
+            </wp:cNvGraphicFramePr>
+            <a:graphic xmlns:a="http://schemas.openxmlformats.org/drawingml/2006/main">
+              <a:graphicData uri="http://schemas.openxmlformats.org/drawingml/2006/picture">
+                <pic:pic xmlns:pic="http://schemas.openxmlformats.org/drawingml/2006/picture">
+                  <pic:nvPicPr>
+                    <pic:cNvPr id="815613917" name=""/>
+                    <pic:cNvPicPr/>
+                  </pic:nvPicPr>
+                  <pic:blipFill>
+                    <a:blip r:embed="rId7"/>
+                    <a:stretch>
+                      <a:fillRect/>
+                    </a:stretch>
+                  </pic:blipFill>
+                  <pic:spPr>
+                    <a:xfrm>
+                      <a:off x="0" y="0"/>
+                      <a:ext cx="5943600" cy="3449955"/>
+                    </a:xfrm>
+                    <a:prstGeom prst="rect">
+                      <a:avLst/>
+                    </a:prstGeom>
+                  </pic:spPr>
+                </pic:pic>
+              </a:graphicData>
+            </a:graphic>
+          </wp:inline>
+        </w:drawing>
+      </w:r>
     </w:p>
     <w:p/>
     <w:sectPr>

</xml_diff>